<commit_message>
Add Students into User for the Project
</commit_message>
<xml_diff>
--- a/Docs/Empathy Map.docx
+++ b/Docs/Empathy Map.docx
@@ -14,7 +14,7 @@
         <mc:AlternateContent>
           <mc:Choice Requires="wpg">
             <w:drawing>
-              <wp:anchor distT="0" distB="635" distL="113665" distR="113665" simplePos="0" relativeHeight="3" behindDoc="0" locked="0" layoutInCell="0" allowOverlap="1">
+              <wp:anchor distT="0" distB="635" distL="113030" distR="113030" simplePos="0" relativeHeight="3" behindDoc="0" locked="0" layoutInCell="0" allowOverlap="1">
                 <wp:simplePos x="0" y="0"/>
                 <wp:positionH relativeFrom="column">
                   <wp:posOffset>-533400</wp:posOffset>
@@ -91,16 +91,16 @@
                           <wps:cNvSpPr/>
                           <wps:spPr>
                             <a:xfrm>
-                              <a:off x="6619320" y="5223600"/>
-                              <a:ext cx="720" cy="3201840"/>
+                              <a:off x="6619320" y="5224320"/>
+                              <a:ext cx="720" cy="3201120"/>
                             </a:xfrm>
                             <a:custGeom>
                               <a:avLst/>
                               <a:gdLst>
                                 <a:gd name="textAreaLeft" fmla="*/ 0 w 360"/>
-                                <a:gd name="textAreaRight" fmla="*/ 1440 w 360"/>
-                                <a:gd name="textAreaTop" fmla="*/ 0 h 1815120"/>
-                                <a:gd name="textAreaBottom" fmla="*/ 1815840 h 1815120"/>
+                                <a:gd name="textAreaRight" fmla="*/ 2880 w 360"/>
+                                <a:gd name="textAreaTop" fmla="*/ 0 h 1814760"/>
+                                <a:gd name="textAreaBottom" fmla="*/ 1815840 h 1814760"/>
                               </a:gdLst>
                               <a:ahLst/>
                               <a:cxnLst/>
@@ -138,15 +138,15 @@
                           <wps:spPr>
                             <a:xfrm>
                               <a:off x="6619320" y="180360"/>
-                              <a:ext cx="720" cy="3214440"/>
+                              <a:ext cx="720" cy="3213720"/>
                             </a:xfrm>
                             <a:custGeom>
                               <a:avLst/>
                               <a:gdLst>
                                 <a:gd name="textAreaLeft" fmla="*/ 0 w 360"/>
-                                <a:gd name="textAreaRight" fmla="*/ 1440 w 360"/>
-                                <a:gd name="textAreaTop" fmla="*/ 0 h 1822320"/>
-                                <a:gd name="textAreaBottom" fmla="*/ 1823040 h 1822320"/>
+                                <a:gd name="textAreaRight" fmla="*/ 2880 w 360"/>
+                                <a:gd name="textAreaTop" fmla="*/ 0 h 1821960"/>
+                                <a:gd name="textAreaBottom" fmla="*/ 1823040 h 1821960"/>
                               </a:gdLst>
                               <a:ahLst/>
                               <a:cxnLst/>
@@ -183,16 +183,16 @@
                           <wps:cNvSpPr/>
                           <wps:spPr>
                             <a:xfrm>
-                              <a:off x="7598880" y="4315320"/>
-                              <a:ext cx="5630040" cy="720"/>
+                              <a:off x="7599600" y="4315320"/>
+                              <a:ext cx="5629320" cy="720"/>
                             </a:xfrm>
                             <a:custGeom>
                               <a:avLst/>
                               <a:gdLst>
-                                <a:gd name="textAreaLeft" fmla="*/ 0 w 3191760"/>
-                                <a:gd name="textAreaRight" fmla="*/ 3192480 w 3191760"/>
+                                <a:gd name="textAreaLeft" fmla="*/ 0 w 3191400"/>
+                                <a:gd name="textAreaRight" fmla="*/ 3192480 w 3191400"/>
                                 <a:gd name="textAreaTop" fmla="*/ 0 h 360"/>
-                                <a:gd name="textAreaBottom" fmla="*/ 1440 h 360"/>
+                                <a:gd name="textAreaBottom" fmla="*/ 2880 h 360"/>
                               </a:gdLst>
                               <a:ahLst/>
                               <a:cxnLst/>
@@ -230,15 +230,15 @@
                           <wps:spPr>
                             <a:xfrm>
                               <a:off x="0" y="4315320"/>
-                              <a:ext cx="5642640" cy="720"/>
+                              <a:ext cx="5641920" cy="720"/>
                             </a:xfrm>
                             <a:custGeom>
                               <a:avLst/>
                               <a:gdLst>
-                                <a:gd name="textAreaLeft" fmla="*/ 0 w 3198960"/>
-                                <a:gd name="textAreaRight" fmla="*/ 3199680 w 3198960"/>
+                                <a:gd name="textAreaLeft" fmla="*/ 0 w 3198600"/>
+                                <a:gd name="textAreaRight" fmla="*/ 3199680 w 3198600"/>
                                 <a:gd name="textAreaTop" fmla="*/ 0 h 360"/>
-                                <a:gd name="textAreaBottom" fmla="*/ 1440 h 360"/>
+                                <a:gd name="textAreaBottom" fmla="*/ 2880 h 360"/>
                               </a:gdLst>
                               <a:ahLst/>
                               <a:cxnLst/>
@@ -275,8 +275,8 @@
                           <wps:cNvSpPr/>
                           <wps:spPr>
                             <a:xfrm>
-                              <a:off x="7834680" y="393120"/>
-                              <a:ext cx="2072160" cy="622800"/>
+                              <a:off x="7835400" y="393120"/>
+                              <a:ext cx="2071440" cy="622440"/>
                             </a:xfrm>
                             <a:prstGeom prst="rect">
                               <a:avLst/>
@@ -320,8 +320,8 @@
                           <wps:cNvSpPr/>
                           <wps:spPr>
                             <a:xfrm>
-                              <a:off x="9755640" y="4446360"/>
-                              <a:ext cx="1527840" cy="624240"/>
+                              <a:off x="9756000" y="4446360"/>
+                              <a:ext cx="1527120" cy="624240"/>
                             </a:xfrm>
                             <a:prstGeom prst="rect">
                               <a:avLst/>
@@ -365,8 +365,8 @@
                           <wps:cNvSpPr/>
                           <wps:spPr>
                             <a:xfrm>
-                              <a:off x="1627560" y="4538520"/>
-                              <a:ext cx="909360" cy="622800"/>
+                              <a:off x="1627560" y="4538880"/>
+                              <a:ext cx="908640" cy="622440"/>
                             </a:xfrm>
                             <a:prstGeom prst="rect">
                               <a:avLst/>
@@ -411,7 +411,7 @@
                           <wps:spPr>
                             <a:xfrm>
                               <a:off x="1982520" y="360000"/>
-                              <a:ext cx="1230120" cy="622800"/>
+                              <a:ext cx="1229400" cy="622440"/>
                             </a:xfrm>
                             <a:prstGeom prst="rect">
                               <a:avLst/>
@@ -456,7 +456,7 @@
                           <wps:spPr>
                             <a:xfrm>
                               <a:off x="585360" y="3960"/>
-                              <a:ext cx="1524600" cy="187920"/>
+                              <a:ext cx="1523880" cy="187200"/>
                             </a:xfrm>
                             <a:prstGeom prst="rect">
                               <a:avLst/>
@@ -508,8 +508,8 @@
                           <wps:cNvSpPr/>
                           <wps:spPr>
                             <a:xfrm>
-                              <a:off x="11189880" y="8688240"/>
-                              <a:ext cx="3089160" cy="357480"/>
+                              <a:off x="11190600" y="8688600"/>
+                              <a:ext cx="3088800" cy="356760"/>
                             </a:xfrm>
                             <a:prstGeom prst="rect">
                               <a:avLst/>
@@ -552,16 +552,16 @@
                           <wps:cNvSpPr/>
                           <wps:spPr>
                             <a:xfrm>
-                              <a:off x="10984320" y="8730720"/>
-                              <a:ext cx="720" cy="158760"/>
+                              <a:off x="10985040" y="8731080"/>
+                              <a:ext cx="720" cy="158040"/>
                             </a:xfrm>
                             <a:custGeom>
                               <a:avLst/>
                               <a:gdLst>
                                 <a:gd name="textAreaLeft" fmla="*/ 0 w 360"/>
-                                <a:gd name="textAreaRight" fmla="*/ 1440 w 360"/>
-                                <a:gd name="textAreaTop" fmla="*/ 0 h 90000"/>
-                                <a:gd name="textAreaBottom" fmla="*/ 90720 h 90000"/>
+                                <a:gd name="textAreaRight" fmla="*/ 2880 w 360"/>
+                                <a:gd name="textAreaTop" fmla="*/ 0 h 89640"/>
+                                <a:gd name="textAreaBottom" fmla="*/ 90720 h 89640"/>
                               </a:gdLst>
                               <a:ahLst/>
                               <a:cxnLst/>
@@ -598,8 +598,8 @@
                           <wps:cNvSpPr/>
                           <wps:spPr>
                             <a:xfrm>
-                              <a:off x="10984320" y="44280"/>
-                              <a:ext cx="855360" cy="156240"/>
+                              <a:off x="10985040" y="44280"/>
+                              <a:ext cx="854640" cy="155520"/>
                             </a:xfrm>
                             <a:prstGeom prst="rect">
                               <a:avLst/>
@@ -643,16 +643,16 @@
                           <wps:cNvSpPr/>
                           <wps:spPr>
                             <a:xfrm>
-                              <a:off x="10875600" y="0"/>
-                              <a:ext cx="720" cy="157320"/>
+                              <a:off x="10876320" y="0"/>
+                              <a:ext cx="720" cy="156960"/>
                             </a:xfrm>
                             <a:custGeom>
                               <a:avLst/>
                               <a:gdLst>
                                 <a:gd name="textAreaLeft" fmla="*/ 0 w 360"/>
-                                <a:gd name="textAreaRight" fmla="*/ 1440 w 360"/>
-                                <a:gd name="textAreaTop" fmla="*/ 0 h 89280"/>
-                                <a:gd name="textAreaBottom" fmla="*/ 90000 h 89280"/>
+                                <a:gd name="textAreaRight" fmla="*/ 2880 w 360"/>
+                                <a:gd name="textAreaTop" fmla="*/ 0 h 88920"/>
+                                <a:gd name="textAreaBottom" fmla="*/ 90000 h 88920"/>
                               </a:gdLst>
                               <a:ahLst/>
                               <a:cxnLst/>
@@ -689,16 +689,16 @@
                           <wps:cNvSpPr/>
                           <wps:spPr>
                             <a:xfrm>
-                              <a:off x="10873800" y="487800"/>
-                              <a:ext cx="2317680" cy="720"/>
+                              <a:off x="10874520" y="487800"/>
+                              <a:ext cx="2316960" cy="720"/>
                             </a:xfrm>
                             <a:custGeom>
                               <a:avLst/>
                               <a:gdLst>
-                                <a:gd name="textAreaLeft" fmla="*/ 0 w 1314000"/>
-                                <a:gd name="textAreaRight" fmla="*/ 1314720 w 1314000"/>
+                                <a:gd name="textAreaLeft" fmla="*/ 0 w 1313640"/>
+                                <a:gd name="textAreaRight" fmla="*/ 1314720 w 1313640"/>
                                 <a:gd name="textAreaTop" fmla="*/ 0 h 360"/>
-                                <a:gd name="textAreaBottom" fmla="*/ 1440 h 360"/>
+                                <a:gd name="textAreaBottom" fmla="*/ 2880 h 360"/>
                               </a:gdLst>
                               <a:ahLst/>
                               <a:cxnLst/>
@@ -737,16 +737,16 @@
                           <wps:cNvSpPr/>
                           <wps:spPr>
                             <a:xfrm>
-                              <a:off x="10024920" y="5040"/>
-                              <a:ext cx="582840" cy="545400"/>
+                              <a:off x="10025280" y="5040"/>
+                              <a:ext cx="582120" cy="544680"/>
                             </a:xfrm>
                             <a:custGeom>
                               <a:avLst/>
                               <a:gdLst>
-                                <a:gd name="textAreaLeft" fmla="*/ 0 w 330480"/>
-                                <a:gd name="textAreaRight" fmla="*/ 331200 w 330480"/>
-                                <a:gd name="textAreaTop" fmla="*/ 0 h 309240"/>
-                                <a:gd name="textAreaBottom" fmla="*/ 309960 h 309240"/>
+                                <a:gd name="textAreaLeft" fmla="*/ 0 w 330120"/>
+                                <a:gd name="textAreaRight" fmla="*/ 331200 w 330120"/>
+                                <a:gd name="textAreaTop" fmla="*/ 0 h 308880"/>
+                                <a:gd name="textAreaBottom" fmla="*/ 309960 h 308880"/>
                               </a:gdLst>
                               <a:ahLst/>
                               <a:cxnLst/>
@@ -816,16 +816,16 @@
                           <wps:cNvSpPr/>
                           <wps:spPr>
                             <a:xfrm>
-                              <a:off x="10220400" y="127800"/>
-                              <a:ext cx="170640" cy="264240"/>
+                              <a:off x="10221120" y="127800"/>
+                              <a:ext cx="170280" cy="263520"/>
                             </a:xfrm>
                             <a:custGeom>
                               <a:avLst/>
                               <a:gdLst>
-                                <a:gd name="textAreaLeft" fmla="*/ 0 w 96840"/>
-                                <a:gd name="textAreaRight" fmla="*/ 97560 w 96840"/>
-                                <a:gd name="textAreaTop" fmla="*/ 0 h 149760"/>
-                                <a:gd name="textAreaBottom" fmla="*/ 150480 h 149760"/>
+                                <a:gd name="textAreaLeft" fmla="*/ 0 w 96480"/>
+                                <a:gd name="textAreaRight" fmla="*/ 97560 w 96480"/>
+                                <a:gd name="textAreaTop" fmla="*/ 0 h 149400"/>
+                                <a:gd name="textAreaBottom" fmla="*/ 150480 h 149400"/>
                               </a:gdLst>
                               <a:ahLst/>
                               <a:cxnLst/>
@@ -901,16 +901,16 @@
                           <wps:cNvSpPr/>
                           <wps:spPr>
                             <a:xfrm>
-                              <a:off x="10219680" y="127800"/>
-                              <a:ext cx="173880" cy="266760"/>
+                              <a:off x="10220400" y="127800"/>
+                              <a:ext cx="173520" cy="266040"/>
                             </a:xfrm>
                             <a:custGeom>
                               <a:avLst/>
                               <a:gdLst>
-                                <a:gd name="textAreaLeft" fmla="*/ 0 w 98640"/>
-                                <a:gd name="textAreaRight" fmla="*/ 99360 w 98640"/>
-                                <a:gd name="textAreaTop" fmla="*/ 0 h 151200"/>
-                                <a:gd name="textAreaBottom" fmla="*/ 151920 h 151200"/>
+                                <a:gd name="textAreaLeft" fmla="*/ 0 w 98280"/>
+                                <a:gd name="textAreaRight" fmla="*/ 99360 w 98280"/>
+                                <a:gd name="textAreaTop" fmla="*/ 0 h 150840"/>
+                                <a:gd name="textAreaBottom" fmla="*/ 151920 h 150840"/>
                               </a:gdLst>
                               <a:ahLst/>
                               <a:cxnLst/>
@@ -1071,16 +1071,16 @@
                           <wps:cNvSpPr/>
                           <wps:spPr>
                             <a:xfrm>
-                              <a:off x="10264320" y="312480"/>
-                              <a:ext cx="48960" cy="45720"/>
+                              <a:off x="10264680" y="312480"/>
+                              <a:ext cx="48240" cy="45000"/>
                             </a:xfrm>
                             <a:custGeom>
                               <a:avLst/>
                               <a:gdLst>
-                                <a:gd name="textAreaLeft" fmla="*/ 0 w 27720"/>
-                                <a:gd name="textAreaRight" fmla="*/ 28440 w 27720"/>
-                                <a:gd name="textAreaTop" fmla="*/ 0 h 25920"/>
-                                <a:gd name="textAreaBottom" fmla="*/ 26640 h 25920"/>
+                                <a:gd name="textAreaLeft" fmla="*/ 0 w 27360"/>
+                                <a:gd name="textAreaRight" fmla="*/ 28440 w 27360"/>
+                                <a:gd name="textAreaTop" fmla="*/ 0 h 25560"/>
+                                <a:gd name="textAreaBottom" fmla="*/ 26640 h 25560"/>
                               </a:gdLst>
                               <a:ahLst/>
                               <a:cxnLst/>
@@ -1148,16 +1148,16 @@
                           <wps:cNvSpPr/>
                           <wps:spPr>
                             <a:xfrm>
-                              <a:off x="10262160" y="308520"/>
-                              <a:ext cx="53280" cy="21600"/>
+                              <a:off x="10262880" y="308520"/>
+                              <a:ext cx="52560" cy="20880"/>
                             </a:xfrm>
                             <a:custGeom>
                               <a:avLst/>
                               <a:gdLst>
-                                <a:gd name="textAreaLeft" fmla="*/ 0 w 30240"/>
-                                <a:gd name="textAreaRight" fmla="*/ 30960 w 30240"/>
-                                <a:gd name="textAreaTop" fmla="*/ 0 h 12240"/>
-                                <a:gd name="textAreaBottom" fmla="*/ 12960 h 12240"/>
+                                <a:gd name="textAreaLeft" fmla="*/ 0 w 29880"/>
+                                <a:gd name="textAreaRight" fmla="*/ 30960 w 29880"/>
+                                <a:gd name="textAreaTop" fmla="*/ 0 h 11880"/>
+                                <a:gd name="textAreaBottom" fmla="*/ 12960 h 11880"/>
                               </a:gdLst>
                               <a:ahLst/>
                               <a:cxnLst/>
@@ -1242,16 +1242,16 @@
                           <wps:cNvSpPr/>
                           <wps:spPr>
                             <a:xfrm>
-                              <a:off x="10245240" y="226800"/>
-                              <a:ext cx="13320" cy="41760"/>
+                              <a:off x="10245600" y="226800"/>
+                              <a:ext cx="12600" cy="41400"/>
                             </a:xfrm>
                             <a:custGeom>
                               <a:avLst/>
                               <a:gdLst>
-                                <a:gd name="textAreaLeft" fmla="*/ 0 w 7560"/>
-                                <a:gd name="textAreaRight" fmla="*/ 8280 w 7560"/>
-                                <a:gd name="textAreaTop" fmla="*/ 0 h 23760"/>
-                                <a:gd name="textAreaBottom" fmla="*/ 24480 h 23760"/>
+                                <a:gd name="textAreaLeft" fmla="*/ 0 w 7200"/>
+                                <a:gd name="textAreaRight" fmla="*/ 8280 w 7200"/>
+                                <a:gd name="textAreaTop" fmla="*/ 0 h 23400"/>
+                                <a:gd name="textAreaBottom" fmla="*/ 24480 h 23400"/>
                               </a:gdLst>
                               <a:ahLst/>
                               <a:cxnLst/>
@@ -1338,16 +1338,16 @@
                           <wps:cNvSpPr/>
                           <wps:spPr>
                             <a:xfrm>
-                              <a:off x="10186560" y="103680"/>
-                              <a:ext cx="227160" cy="177840"/>
+                              <a:off x="10187280" y="103680"/>
+                              <a:ext cx="226800" cy="177120"/>
                             </a:xfrm>
                             <a:custGeom>
                               <a:avLst/>
                               <a:gdLst>
-                                <a:gd name="textAreaLeft" fmla="*/ 0 w 128880"/>
-                                <a:gd name="textAreaRight" fmla="*/ 129600 w 128880"/>
-                                <a:gd name="textAreaTop" fmla="*/ 0 h 100800"/>
-                                <a:gd name="textAreaBottom" fmla="*/ 101520 h 100800"/>
+                                <a:gd name="textAreaLeft" fmla="*/ 0 w 128520"/>
+                                <a:gd name="textAreaRight" fmla="*/ 129600 w 128520"/>
+                                <a:gd name="textAreaTop" fmla="*/ 0 h 100440"/>
+                                <a:gd name="textAreaBottom" fmla="*/ 101520 h 100440"/>
                               </a:gdLst>
                               <a:ahLst/>
                               <a:cxnLst/>
@@ -1467,16 +1467,16 @@
                           <wps:cNvSpPr/>
                           <wps:spPr>
                             <a:xfrm>
-                              <a:off x="10331280" y="222840"/>
-                              <a:ext cx="29160" cy="26640"/>
+                              <a:off x="10332000" y="222840"/>
+                              <a:ext cx="28440" cy="25920"/>
                             </a:xfrm>
                             <a:custGeom>
                               <a:avLst/>
                               <a:gdLst>
-                                <a:gd name="textAreaLeft" fmla="*/ 0 w 16560"/>
-                                <a:gd name="textAreaRight" fmla="*/ 17280 w 16560"/>
-                                <a:gd name="textAreaTop" fmla="*/ 0 h 15120"/>
-                                <a:gd name="textAreaBottom" fmla="*/ 15840 h 15120"/>
+                                <a:gd name="textAreaLeft" fmla="*/ 0 w 16200"/>
+                                <a:gd name="textAreaRight" fmla="*/ 17280 w 16200"/>
+                                <a:gd name="textAreaTop" fmla="*/ 0 h 14760"/>
+                                <a:gd name="textAreaBottom" fmla="*/ 15840 h 14760"/>
                               </a:gdLst>
                               <a:ahLst/>
                               <a:cxnLst/>
@@ -1546,16 +1546,16 @@
                           <wps:cNvSpPr/>
                           <wps:spPr>
                             <a:xfrm>
-                              <a:off x="10105920" y="384120"/>
-                              <a:ext cx="432360" cy="166320"/>
+                              <a:off x="10106640" y="384120"/>
+                              <a:ext cx="431640" cy="165600"/>
                             </a:xfrm>
                             <a:custGeom>
                               <a:avLst/>
                               <a:gdLst>
-                                <a:gd name="textAreaLeft" fmla="*/ 0 w 245160"/>
-                                <a:gd name="textAreaRight" fmla="*/ 245880 w 245160"/>
-                                <a:gd name="textAreaTop" fmla="*/ 0 h 94320"/>
-                                <a:gd name="textAreaBottom" fmla="*/ 95040 h 94320"/>
+                                <a:gd name="textAreaLeft" fmla="*/ 0 w 244800"/>
+                                <a:gd name="textAreaRight" fmla="*/ 245880 w 244800"/>
+                                <a:gd name="textAreaTop" fmla="*/ 0 h 93960"/>
+                                <a:gd name="textAreaBottom" fmla="*/ 95040 h 93960"/>
                               </a:gdLst>
                               <a:ahLst/>
                               <a:cxnLst/>
@@ -1643,16 +1643,16 @@
                           <wps:cNvSpPr/>
                           <wps:spPr>
                             <a:xfrm>
-                              <a:off x="10024920" y="5040"/>
-                              <a:ext cx="582840" cy="545400"/>
+                              <a:off x="10025280" y="5040"/>
+                              <a:ext cx="582120" cy="544680"/>
                             </a:xfrm>
                             <a:custGeom>
                               <a:avLst/>
                               <a:gdLst>
-                                <a:gd name="textAreaLeft" fmla="*/ 0 w 330480"/>
-                                <a:gd name="textAreaRight" fmla="*/ 331200 w 330480"/>
-                                <a:gd name="textAreaTop" fmla="*/ 0 h 309240"/>
-                                <a:gd name="textAreaBottom" fmla="*/ 309960 h 309240"/>
+                                <a:gd name="textAreaLeft" fmla="*/ 0 w 330120"/>
+                                <a:gd name="textAreaRight" fmla="*/ 331200 w 330120"/>
+                                <a:gd name="textAreaTop" fmla="*/ 0 h 308880"/>
+                                <a:gd name="textAreaBottom" fmla="*/ 309960 h 308880"/>
                               </a:gdLst>
                               <a:ahLst/>
                               <a:cxnLst/>
@@ -1724,15 +1724,15 @@
                           <wps:spPr>
                             <a:xfrm>
                               <a:off x="6297840" y="3804120"/>
-                              <a:ext cx="573480" cy="887040"/>
+                              <a:ext cx="572760" cy="887040"/>
                             </a:xfrm>
                             <a:custGeom>
                               <a:avLst/>
                               <a:gdLst>
-                                <a:gd name="textAreaLeft" fmla="*/ 0 w 325080"/>
-                                <a:gd name="textAreaRight" fmla="*/ 325800 w 325080"/>
+                                <a:gd name="textAreaLeft" fmla="*/ 0 w 324720"/>
+                                <a:gd name="textAreaRight" fmla="*/ 325800 w 324720"/>
                                 <a:gd name="textAreaTop" fmla="*/ 0 h 502920"/>
-                                <a:gd name="textAreaBottom" fmla="*/ 503640 h 502920"/>
+                                <a:gd name="textAreaBottom" fmla="*/ 504000 h 502920"/>
                               </a:gdLst>
                               <a:ahLst/>
                               <a:cxnLst/>
@@ -1809,15 +1809,15 @@
                           <wps:spPr>
                             <a:xfrm>
                               <a:off x="6296040" y="3804840"/>
-                              <a:ext cx="583560" cy="894600"/>
+                              <a:ext cx="582840" cy="894600"/>
                             </a:xfrm>
                             <a:custGeom>
                               <a:avLst/>
                               <a:gdLst>
-                                <a:gd name="textAreaLeft" fmla="*/ 0 w 330840"/>
-                                <a:gd name="textAreaRight" fmla="*/ 331560 w 330840"/>
+                                <a:gd name="textAreaLeft" fmla="*/ 0 w 330480"/>
+                                <a:gd name="textAreaRight" fmla="*/ 331560 w 330480"/>
                                 <a:gd name="textAreaTop" fmla="*/ 0 h 507240"/>
-                                <a:gd name="textAreaBottom" fmla="*/ 507960 h 507240"/>
+                                <a:gd name="textAreaBottom" fmla="*/ 508320 h 507240"/>
                               </a:gdLst>
                               <a:ahLst/>
                               <a:cxnLst/>
@@ -1979,15 +1979,15 @@
                           <wps:spPr>
                             <a:xfrm>
                               <a:off x="6444000" y="4415760"/>
-                              <a:ext cx="181080" cy="163800"/>
+                              <a:ext cx="180360" cy="163800"/>
                             </a:xfrm>
                             <a:custGeom>
                               <a:avLst/>
                               <a:gdLst>
-                                <a:gd name="textAreaLeft" fmla="*/ 0 w 102600"/>
-                                <a:gd name="textAreaRight" fmla="*/ 103320 w 102600"/>
+                                <a:gd name="textAreaLeft" fmla="*/ 0 w 102240"/>
+                                <a:gd name="textAreaRight" fmla="*/ 103320 w 102240"/>
                                 <a:gd name="textAreaTop" fmla="*/ 0 h 92880"/>
-                                <a:gd name="textAreaBottom" fmla="*/ 93600 h 92880"/>
+                                <a:gd name="textAreaBottom" fmla="*/ 93960 h 92880"/>
                               </a:gdLst>
                               <a:ahLst/>
                               <a:cxnLst/>
@@ -2056,15 +2056,15 @@
                           <wps:spPr>
                             <a:xfrm>
                               <a:off x="6438240" y="4410000"/>
-                              <a:ext cx="180360" cy="74160"/>
+                              <a:ext cx="179640" cy="73800"/>
                             </a:xfrm>
                             <a:custGeom>
                               <a:avLst/>
                               <a:gdLst>
-                                <a:gd name="textAreaLeft" fmla="*/ 0 w 102240"/>
-                                <a:gd name="textAreaRight" fmla="*/ 102960 w 102240"/>
-                                <a:gd name="textAreaTop" fmla="*/ 0 h 42120"/>
-                                <a:gd name="textAreaBottom" fmla="*/ 42840 h 42120"/>
+                                <a:gd name="textAreaLeft" fmla="*/ 0 w 101880"/>
+                                <a:gd name="textAreaRight" fmla="*/ 102960 w 101880"/>
+                                <a:gd name="textAreaTop" fmla="*/ 0 h 41760"/>
+                                <a:gd name="textAreaBottom" fmla="*/ 42840 h 41760"/>
                               </a:gdLst>
                               <a:ahLst/>
                               <a:cxnLst/>
@@ -2155,15 +2155,15 @@
                           <wps:spPr>
                             <a:xfrm>
                               <a:off x="6379200" y="4134600"/>
-                              <a:ext cx="48240" cy="142200"/>
+                              <a:ext cx="47520" cy="141480"/>
                             </a:xfrm>
                             <a:custGeom>
                               <a:avLst/>
                               <a:gdLst>
-                                <a:gd name="textAreaLeft" fmla="*/ 0 w 27360"/>
-                                <a:gd name="textAreaRight" fmla="*/ 28080 w 27360"/>
-                                <a:gd name="textAreaTop" fmla="*/ 0 h 80640"/>
-                                <a:gd name="textAreaBottom" fmla="*/ 81360 h 80640"/>
+                                <a:gd name="textAreaLeft" fmla="*/ 0 w 27000"/>
+                                <a:gd name="textAreaRight" fmla="*/ 28080 w 27000"/>
+                                <a:gd name="textAreaTop" fmla="*/ 0 h 80280"/>
+                                <a:gd name="textAreaBottom" fmla="*/ 81360 h 80280"/>
                               </a:gdLst>
                               <a:ahLst/>
                               <a:cxnLst/>
@@ -2251,15 +2251,15 @@
                           <wps:spPr>
                             <a:xfrm>
                               <a:off x="6185520" y="3724920"/>
-                              <a:ext cx="761400" cy="596160"/>
+                              <a:ext cx="760680" cy="595800"/>
                             </a:xfrm>
                             <a:custGeom>
                               <a:avLst/>
                               <a:gdLst>
-                                <a:gd name="textAreaLeft" fmla="*/ 0 w 431640"/>
-                                <a:gd name="textAreaRight" fmla="*/ 432360 w 431640"/>
-                                <a:gd name="textAreaTop" fmla="*/ 0 h 338040"/>
-                                <a:gd name="textAreaBottom" fmla="*/ 338760 h 338040"/>
+                                <a:gd name="textAreaLeft" fmla="*/ 0 w 431280"/>
+                                <a:gd name="textAreaRight" fmla="*/ 432360 w 431280"/>
+                                <a:gd name="textAreaTop" fmla="*/ 0 h 337680"/>
+                                <a:gd name="textAreaBottom" fmla="*/ 338760 h 337680"/>
                               </a:gdLst>
                               <a:ahLst/>
                               <a:cxnLst/>
@@ -2380,15 +2380,15 @@
                           <wps:spPr>
                             <a:xfrm>
                               <a:off x="6669360" y="4121640"/>
-                              <a:ext cx="99720" cy="93240"/>
+                              <a:ext cx="99000" cy="92880"/>
                             </a:xfrm>
                             <a:custGeom>
                               <a:avLst/>
                               <a:gdLst>
-                                <a:gd name="textAreaLeft" fmla="*/ 0 w 56520"/>
-                                <a:gd name="textAreaRight" fmla="*/ 57240 w 56520"/>
-                                <a:gd name="textAreaTop" fmla="*/ 0 h 52920"/>
-                                <a:gd name="textAreaBottom" fmla="*/ 53640 h 52920"/>
+                                <a:gd name="textAreaLeft" fmla="*/ 0 w 56160"/>
+                                <a:gd name="textAreaRight" fmla="*/ 57240 w 56160"/>
+                                <a:gd name="textAreaTop" fmla="*/ 0 h 52560"/>
+                                <a:gd name="textAreaBottom" fmla="*/ 53640 h 52560"/>
                               </a:gdLst>
                               <a:ahLst/>
                               <a:cxnLst/>
@@ -2458,16 +2458,16 @@
                           <wps:cNvSpPr/>
                           <wps:spPr>
                             <a:xfrm>
-                              <a:off x="5913000" y="4664160"/>
-                              <a:ext cx="1454760" cy="558000"/>
+                              <a:off x="5913000" y="4664880"/>
+                              <a:ext cx="1454760" cy="557640"/>
                             </a:xfrm>
                             <a:custGeom>
                               <a:avLst/>
                               <a:gdLst>
                                 <a:gd name="textAreaLeft" fmla="*/ 0 w 824760"/>
-                                <a:gd name="textAreaRight" fmla="*/ 825480 w 824760"/>
-                                <a:gd name="textAreaTop" fmla="*/ 0 h 316440"/>
-                                <a:gd name="textAreaBottom" fmla="*/ 317160 h 316440"/>
+                                <a:gd name="textAreaRight" fmla="*/ 825840 w 824760"/>
+                                <a:gd name="textAreaTop" fmla="*/ 0 h 316080"/>
+                                <a:gd name="textAreaBottom" fmla="*/ 317160 h 316080"/>
                               </a:gdLst>
                               <a:ahLst/>
                               <a:cxnLst/>
@@ -2562,9 +2562,9 @@
                               <a:avLst/>
                               <a:gdLst>
                                 <a:gd name="textAreaLeft" fmla="*/ 0 w 1106280"/>
-                                <a:gd name="textAreaRight" fmla="*/ 1107000 w 1106280"/>
+                                <a:gd name="textAreaRight" fmla="*/ 1107360 w 1106280"/>
                                 <a:gd name="textAreaTop" fmla="*/ 0 h 1035360"/>
-                                <a:gd name="textAreaBottom" fmla="*/ 1036080 h 1035360"/>
+                                <a:gd name="textAreaBottom" fmla="*/ 1036440 h 1035360"/>
                               </a:gdLst>
                               <a:ahLst/>
                               <a:cxnLst/>
@@ -2660,7 +2660,7 @@
                     </v:textbox>
                     <w10:wrap type="square"/>
                   </v:rect>
-                  <v:rect id="shape_0" stroked="f" o:allowincell="f" style="position:absolute;left:11498;top:620;width:3262;height:980;mso-wrap-style:square;v-text-anchor:top">
+                  <v:rect id="shape_0" stroked="f" o:allowincell="f" style="position:absolute;left:11499;top:620;width:3261;height:979;mso-wrap-style:square;v-text-anchor:top">
                     <v:fill o:detectmouseclick="t" on="false"/>
                     <v:stroke color="#3465a4" joinstyle="round" endcap="flat"/>
                     <v:textbox>
@@ -2684,7 +2684,7 @@
                     </v:textbox>
                     <w10:wrap type="square"/>
                   </v:rect>
-                  <v:rect id="shape_0" stroked="f" o:allowincell="f" style="position:absolute;left:14523;top:7003;width:2405;height:982;mso-wrap-style:square;v-text-anchor:top">
+                  <v:rect id="shape_0" stroked="f" o:allowincell="f" style="position:absolute;left:14524;top:7003;width:2404;height:982;mso-wrap-style:square;v-text-anchor:top">
                     <v:fill o:detectmouseclick="t" on="false"/>
                     <v:stroke color="#3465a4" joinstyle="round" endcap="flat"/>
                     <v:textbox>
@@ -2708,7 +2708,7 @@
                     </v:textbox>
                     <w10:wrap type="square"/>
                   </v:rect>
-                  <v:rect id="shape_0" stroked="f" o:allowincell="f" style="position:absolute;left:1723;top:7148;width:1431;height:980;mso-wrap-style:square;v-text-anchor:top">
+                  <v:rect id="shape_0" stroked="f" o:allowincell="f" style="position:absolute;left:1723;top:7149;width:1430;height:979;mso-wrap-style:square;v-text-anchor:top">
                     <v:fill o:detectmouseclick="t" on="false"/>
                     <v:stroke color="#3465a4" joinstyle="round" endcap="flat"/>
                     <v:textbox>
@@ -2732,7 +2732,7 @@
                     </v:textbox>
                     <w10:wrap type="square"/>
                   </v:rect>
-                  <v:rect id="shape_0" stroked="f" o:allowincell="f" style="position:absolute;left:2282;top:568;width:1936;height:980;mso-wrap-style:square;v-text-anchor:top">
+                  <v:rect id="shape_0" stroked="f" o:allowincell="f" style="position:absolute;left:2282;top:568;width:1935;height:979;mso-wrap-style:square;v-text-anchor:top">
                     <v:fill o:detectmouseclick="t" on="false"/>
                     <v:stroke color="#3465a4" joinstyle="round" endcap="flat"/>
                     <v:textbox>
@@ -2756,7 +2756,7 @@
                     </v:textbox>
                     <w10:wrap type="square"/>
                   </v:rect>
-                  <v:rect id="shape_0" stroked="f" o:allowincell="f" style="position:absolute;left:82;top:7;width:2400;height:295;mso-wrap-style:square;v-text-anchor:top">
+                  <v:rect id="shape_0" stroked="f" o:allowincell="f" style="position:absolute;left:82;top:7;width:2399;height:294;mso-wrap-style:square;v-text-anchor:top">
                     <v:fill o:detectmouseclick="t" on="false"/>
                     <v:stroke color="#3465a4" joinstyle="round" endcap="flat"/>
                     <v:textbox>
@@ -2788,7 +2788,7 @@
                     </v:textbox>
                     <w10:wrap type="square"/>
                   </v:rect>
-                  <v:rect id="shape_0" stroked="f" o:allowincell="f" style="position:absolute;left:16782;top:13683;width:4864;height:562;mso-wrap-style:square;v-text-anchor:top">
+                  <v:rect id="shape_0" stroked="f" o:allowincell="f" style="position:absolute;left:16783;top:13684;width:4863;height:561;mso-wrap-style:square;v-text-anchor:top">
                     <v:fill o:detectmouseclick="t" on="false"/>
                     <v:stroke color="#3465a4" joinstyle="round" endcap="flat"/>
                     <v:textbox>
@@ -2811,7 +2811,7 @@
                     </v:textbox>
                     <w10:wrap type="square"/>
                   </v:rect>
-                  <v:rect id="shape_0" stroked="f" o:allowincell="f" style="position:absolute;left:16458;top:71;width:1346;height:245;mso-wrap-style:square;v-text-anchor:top">
+                  <v:rect id="shape_0" stroked="f" o:allowincell="f" style="position:absolute;left:16459;top:71;width:1345;height:244;mso-wrap-style:square;v-text-anchor:top">
                     <v:fill o:detectmouseclick="t" on="false"/>
                     <v:stroke color="#3465a4" joinstyle="round" endcap="flat"/>
                     <v:textbox>
@@ -2843,13 +2843,13 @@
         <mc:AlternateContent>
           <mc:Choice Requires="wps">
             <w:drawing>
-              <wp:anchor distT="40640" distB="40005" distL="108585" distR="109855" simplePos="0" relativeHeight="31" behindDoc="0" locked="0" layoutInCell="0" allowOverlap="1">
+              <wp:anchor distT="41275" distB="39370" distL="108585" distR="109855" simplePos="0" relativeHeight="31" behindDoc="0" locked="0" layoutInCell="0" allowOverlap="1">
                 <wp:simplePos x="0" y="0"/>
                 <wp:positionH relativeFrom="column">
-                  <wp:posOffset>4390390</wp:posOffset>
+                  <wp:posOffset>4295140</wp:posOffset>
                 </wp:positionH>
                 <wp:positionV relativeFrom="paragraph">
-                  <wp:posOffset>5280025</wp:posOffset>
+                  <wp:posOffset>5203825</wp:posOffset>
                 </wp:positionV>
                 <wp:extent cx="3819525" cy="699770"/>
                 <wp:effectExtent l="5715" t="5715" r="4445" b="4445"/>
@@ -2887,7 +2887,7 @@
                         <w:txbxContent>
                           <w:p>
                             <w:pPr>
-                              <w:pStyle w:val="FrameContentsuser"/>
+                              <w:pStyle w:val="FrameContents"/>
                               <w:spacing w:lineRule="auto" w:line="259" w:before="0" w:after="160"/>
                               <w:rPr/>
                             </w:pPr>
@@ -2912,7 +2912,51 @@
                                 <w:sz w:val="22"/>
                                 <w:szCs w:val="22"/>
                               </w:rPr>
-                              <w:t>A home internet user managing a shared family connection — and/or a gamer frustrated by inconsistent ping.</w:t>
+                              <w:t xml:space="preserve">A home internet user managing a shared family connection — and/or a gamer frustrated by inconsistent ping </w:t>
+                            </w:r>
+                            <w:r>
+                              <w:rPr>
+                                <w:color w:val="262D32"/>
+                                <w:sz w:val="22"/>
+                                <w:szCs w:val="22"/>
+                              </w:rPr>
+                              <w:t>and Students who Anxious about send homework late</w:t>
+                            </w:r>
+                          </w:p>
+                          <w:p>
+                            <w:pPr>
+                              <w:pStyle w:val="FrameContents"/>
+                              <w:spacing w:lineRule="auto" w:line="259" w:before="0" w:after="160"/>
+                              <w:rPr>
+                                <w:color w:val="262D32"/>
+                                <w:sz w:val="14"/>
+                                <w:szCs w:val="14"/>
+                              </w:rPr>
+                            </w:pPr>
+                            <w:r>
+                              <w:rPr>
+                                <w:color w:val="262D32"/>
+                                <w:sz w:val="14"/>
+                                <w:szCs w:val="14"/>
+                              </w:rPr>
+                            </w:r>
+                          </w:p>
+                          <w:p>
+                            <w:pPr>
+                              <w:pStyle w:val="FrameContents"/>
+                              <w:spacing w:lineRule="auto" w:line="259" w:before="0" w:after="160"/>
+                              <w:rPr>
+                                <w:sz w:val="18"/>
+                                <w:szCs w:val="18"/>
+                              </w:rPr>
+                            </w:pPr>
+                            <w:r>
+                              <w:rPr>
+                                <w:color w:val="262D32"/>
+                                <w:sz w:val="22"/>
+                                <w:szCs w:val="22"/>
+                              </w:rPr>
+                              <w:t xml:space="preserve">              </w:t>
                             </w:r>
                           </w:p>
                         </w:txbxContent>
@@ -2928,14 +2972,14 @@
           </mc:Choice>
           <mc:Fallback>
             <w:pict>
-              <v:rect id="shape_0" fillcolor="white" stroked="t" o:allowincell="f" style="position:absolute;margin-left:345.7pt;margin-top:415.75pt;width:300.7pt;height:55.05pt;mso-wrap-style:square;v-text-anchor:top">
+              <v:rect id="shape_0" fillcolor="white" stroked="t" o:allowincell="f" style="position:absolute;margin-left:338.2pt;margin-top:409.75pt;width:300.7pt;height:55.05pt;mso-wrap-style:square;v-text-anchor:top">
                 <v:fill o:detectmouseclick="t" type="solid" color2="black"/>
                 <v:stroke color="black" weight="9360" joinstyle="miter" endcap="flat"/>
                 <v:textbox>
                   <w:txbxContent>
                     <w:p>
                       <w:pPr>
-                        <w:pStyle w:val="FrameContentsuser"/>
+                        <w:pStyle w:val="FrameContents"/>
                         <w:spacing w:lineRule="auto" w:line="259" w:before="0" w:after="160"/>
                         <w:rPr/>
                       </w:pPr>
@@ -2960,7 +3004,51 @@
                           <w:sz w:val="22"/>
                           <w:szCs w:val="22"/>
                         </w:rPr>
-                        <w:t>A home internet user managing a shared family connection — and/or a gamer frustrated by inconsistent ping.</w:t>
+                        <w:t xml:space="preserve">A home internet user managing a shared family connection — and/or a gamer frustrated by inconsistent ping </w:t>
+                      </w:r>
+                      <w:r>
+                        <w:rPr>
+                          <w:color w:val="262D32"/>
+                          <w:sz w:val="22"/>
+                          <w:szCs w:val="22"/>
+                        </w:rPr>
+                        <w:t>and Students who Anxious about send homework late</w:t>
+                      </w:r>
+                    </w:p>
+                    <w:p>
+                      <w:pPr>
+                        <w:pStyle w:val="FrameContents"/>
+                        <w:spacing w:lineRule="auto" w:line="259" w:before="0" w:after="160"/>
+                        <w:rPr>
+                          <w:color w:val="262D32"/>
+                          <w:sz w:val="14"/>
+                          <w:szCs w:val="14"/>
+                        </w:rPr>
+                      </w:pPr>
+                      <w:r>
+                        <w:rPr>
+                          <w:color w:val="262D32"/>
+                          <w:sz w:val="14"/>
+                          <w:szCs w:val="14"/>
+                        </w:rPr>
+                      </w:r>
+                    </w:p>
+                    <w:p>
+                      <w:pPr>
+                        <w:pStyle w:val="FrameContents"/>
+                        <w:spacing w:lineRule="auto" w:line="259" w:before="0" w:after="160"/>
+                        <w:rPr>
+                          <w:sz w:val="18"/>
+                          <w:szCs w:val="18"/>
+                        </w:rPr>
+                      </w:pPr>
+                      <w:r>
+                        <w:rPr>
+                          <w:color w:val="262D32"/>
+                          <w:sz w:val="22"/>
+                          <w:szCs w:val="22"/>
+                        </w:rPr>
+                        <w:t xml:space="preserve">              </w:t>
                       </w:r>
                     </w:p>
                   </w:txbxContent>
@@ -3017,7 +3105,7 @@
                         <w:txbxContent>
                           <w:p>
                             <w:pPr>
-                              <w:pStyle w:val="FrameContentsuser"/>
+                              <w:pStyle w:val="FrameContents"/>
                               <w:spacing w:lineRule="auto" w:line="259" w:before="0" w:after="120"/>
                               <w:rPr>
                                 <w:sz w:val="36"/>
@@ -3043,7 +3131,7 @@
                           </w:p>
                           <w:p>
                             <w:pPr>
-                              <w:pStyle w:val="FrameContentsuser"/>
+                              <w:pStyle w:val="FrameContents"/>
                               <w:spacing w:lineRule="auto" w:line="259" w:before="0" w:after="120"/>
                               <w:rPr>
                                 <w:sz w:val="36"/>
@@ -3069,7 +3157,7 @@
                           </w:p>
                           <w:p>
                             <w:pPr>
-                              <w:pStyle w:val="FrameContentsuser"/>
+                              <w:pStyle w:val="FrameContents"/>
                               <w:spacing w:lineRule="auto" w:line="259" w:before="0" w:after="120"/>
                               <w:rPr>
                                 <w:sz w:val="36"/>
@@ -3095,7 +3183,7 @@
                           </w:p>
                           <w:p>
                             <w:pPr>
-                              <w:pStyle w:val="FrameContentsuser"/>
+                              <w:pStyle w:val="FrameContents"/>
                               <w:spacing w:lineRule="auto" w:line="259" w:before="0" w:after="120"/>
                               <w:rPr>
                                 <w:sz w:val="36"/>
@@ -3139,7 +3227,7 @@
                   <w:txbxContent>
                     <w:p>
                       <w:pPr>
-                        <w:pStyle w:val="FrameContentsuser"/>
+                        <w:pStyle w:val="FrameContents"/>
                         <w:spacing w:lineRule="auto" w:line="259" w:before="0" w:after="120"/>
                         <w:rPr>
                           <w:sz w:val="36"/>
@@ -3165,7 +3253,7 @@
                     </w:p>
                     <w:p>
                       <w:pPr>
-                        <w:pStyle w:val="FrameContentsuser"/>
+                        <w:pStyle w:val="FrameContents"/>
                         <w:spacing w:lineRule="auto" w:line="259" w:before="0" w:after="120"/>
                         <w:rPr>
                           <w:sz w:val="36"/>
@@ -3191,7 +3279,7 @@
                     </w:p>
                     <w:p>
                       <w:pPr>
-                        <w:pStyle w:val="FrameContentsuser"/>
+                        <w:pStyle w:val="FrameContents"/>
                         <w:spacing w:lineRule="auto" w:line="259" w:before="0" w:after="120"/>
                         <w:rPr>
                           <w:sz w:val="36"/>
@@ -3217,7 +3305,7 @@
                     </w:p>
                     <w:p>
                       <w:pPr>
-                        <w:pStyle w:val="FrameContentsuser"/>
+                        <w:pStyle w:val="FrameContents"/>
                         <w:spacing w:lineRule="auto" w:line="259" w:before="0" w:after="120"/>
                         <w:rPr>
                           <w:sz w:val="36"/>
@@ -3251,7 +3339,7 @@
         <mc:AlternateContent>
           <mc:Choice Requires="wps">
             <w:drawing>
-              <wp:anchor distT="39370" distB="41910" distL="107950" distR="109855" simplePos="0" relativeHeight="35" behindDoc="0" locked="0" layoutInCell="0" allowOverlap="1">
+              <wp:anchor distT="39370" distB="41910" distL="107315" distR="109855" simplePos="0" relativeHeight="35" behindDoc="0" locked="0" layoutInCell="0" allowOverlap="1">
                 <wp:simplePos x="0" y="0"/>
                 <wp:positionH relativeFrom="column">
                   <wp:posOffset>7294880</wp:posOffset>
@@ -3295,7 +3383,7 @@
                         <w:txbxContent>
                           <w:p>
                             <w:pPr>
-                              <w:pStyle w:val="FrameContentsuser"/>
+                              <w:pStyle w:val="FrameContents"/>
                               <w:spacing w:lineRule="auto" w:line="259" w:before="0" w:after="120"/>
                               <w:rPr>
                                 <w:sz w:val="36"/>
@@ -3321,7 +3409,7 @@
                           </w:p>
                           <w:p>
                             <w:pPr>
-                              <w:pStyle w:val="FrameContentsuser"/>
+                              <w:pStyle w:val="FrameContents"/>
                               <w:spacing w:lineRule="auto" w:line="259" w:before="0" w:after="120"/>
                               <w:rPr>
                                 <w:sz w:val="36"/>
@@ -3347,7 +3435,7 @@
                           </w:p>
                           <w:p>
                             <w:pPr>
-                              <w:pStyle w:val="FrameContentsuser"/>
+                              <w:pStyle w:val="FrameContents"/>
                               <w:spacing w:lineRule="auto" w:line="259" w:before="0" w:after="120"/>
                               <w:rPr>
                                 <w:sz w:val="36"/>
@@ -3373,7 +3461,7 @@
                           </w:p>
                           <w:p>
                             <w:pPr>
-                              <w:pStyle w:val="FrameContentsuser"/>
+                              <w:pStyle w:val="FrameContents"/>
                               <w:spacing w:lineRule="auto" w:line="259" w:before="0" w:after="120"/>
                               <w:rPr>
                                 <w:sz w:val="36"/>
@@ -3417,7 +3505,7 @@
                   <w:txbxContent>
                     <w:p>
                       <w:pPr>
-                        <w:pStyle w:val="FrameContentsuser"/>
+                        <w:pStyle w:val="FrameContents"/>
                         <w:spacing w:lineRule="auto" w:line="259" w:before="0" w:after="120"/>
                         <w:rPr>
                           <w:sz w:val="36"/>
@@ -3443,7 +3531,7 @@
                     </w:p>
                     <w:p>
                       <w:pPr>
-                        <w:pStyle w:val="FrameContentsuser"/>
+                        <w:pStyle w:val="FrameContents"/>
                         <w:spacing w:lineRule="auto" w:line="259" w:before="0" w:after="120"/>
                         <w:rPr>
                           <w:sz w:val="36"/>
@@ -3469,7 +3557,7 @@
                     </w:p>
                     <w:p>
                       <w:pPr>
-                        <w:pStyle w:val="FrameContentsuser"/>
+                        <w:pStyle w:val="FrameContents"/>
                         <w:spacing w:lineRule="auto" w:line="259" w:before="0" w:after="120"/>
                         <w:rPr>
                           <w:sz w:val="36"/>
@@ -3495,7 +3583,7 @@
                     </w:p>
                     <w:p>
                       <w:pPr>
-                        <w:pStyle w:val="FrameContentsuser"/>
+                        <w:pStyle w:val="FrameContents"/>
                         <w:spacing w:lineRule="auto" w:line="259" w:before="0" w:after="120"/>
                         <w:rPr>
                           <w:sz w:val="36"/>
@@ -3535,9 +3623,9 @@
                   <wp:posOffset>-461645</wp:posOffset>
                 </wp:positionH>
                 <wp:positionV relativeFrom="paragraph">
-                  <wp:posOffset>5803265</wp:posOffset>
+                  <wp:posOffset>5964555</wp:posOffset>
                 </wp:positionV>
-                <wp:extent cx="5323205" cy="2691765"/>
+                <wp:extent cx="5323205" cy="2530475"/>
                 <wp:effectExtent l="5715" t="5715" r="4445" b="4445"/>
                 <wp:wrapSquare wrapText="bothSides"/>
                 <wp:docPr id="39" name="Rectangle 238"/>
@@ -3548,7 +3636,7 @@
                       <wps:spPr>
                         <a:xfrm>
                           <a:off x="0" y="0"/>
-                          <a:ext cx="5323320" cy="2691720"/>
+                          <a:ext cx="5323320" cy="2530440"/>
                         </a:xfrm>
                         <a:prstGeom prst="rect">
                           <a:avLst/>
@@ -3573,7 +3661,7 @@
                         <w:txbxContent>
                           <w:p>
                             <w:pPr>
-                              <w:pStyle w:val="FrameContentsuser"/>
+                              <w:pStyle w:val="FrameContents"/>
                               <w:spacing w:lineRule="auto" w:line="259" w:before="0" w:after="120"/>
                               <w:rPr>
                                 <w:sz w:val="36"/>
@@ -3599,7 +3687,7 @@
                           </w:p>
                           <w:p>
                             <w:pPr>
-                              <w:pStyle w:val="FrameContentsuser"/>
+                              <w:pStyle w:val="FrameContents"/>
                               <w:spacing w:lineRule="auto" w:line="259" w:before="0" w:after="120"/>
                               <w:rPr>
                                 <w:sz w:val="36"/>
@@ -3625,7 +3713,7 @@
                           </w:p>
                           <w:p>
                             <w:pPr>
-                              <w:pStyle w:val="FrameContentsuser"/>
+                              <w:pStyle w:val="FrameContents"/>
                               <w:spacing w:lineRule="auto" w:line="259" w:before="0" w:after="120"/>
                               <w:rPr>
                                 <w:sz w:val="36"/>
@@ -3651,7 +3739,7 @@
                           </w:p>
                           <w:p>
                             <w:pPr>
-                              <w:pStyle w:val="FrameContentsuser"/>
+                              <w:pStyle w:val="FrameContents"/>
                               <w:spacing w:lineRule="auto" w:line="259" w:before="0" w:after="120"/>
                               <w:rPr>
                                 <w:sz w:val="36"/>
@@ -3688,14 +3776,14 @@
           </mc:Choice>
           <mc:Fallback>
             <w:pict>
-              <v:rect id="shape_0" fillcolor="white" stroked="t" o:allowincell="f" style="position:absolute;margin-left:-36.35pt;margin-top:456.95pt;width:419.1pt;height:211.9pt;mso-wrap-style:square;v-text-anchor:top">
+              <v:rect id="shape_0" fillcolor="white" stroked="t" o:allowincell="f" style="position:absolute;margin-left:-36.35pt;margin-top:469.65pt;width:419.1pt;height:199.2pt;mso-wrap-style:square;v-text-anchor:top">
                 <v:fill o:detectmouseclick="t" type="solid" color2="black"/>
                 <v:stroke color="black" weight="9360" joinstyle="miter" endcap="flat"/>
                 <v:textbox>
                   <w:txbxContent>
                     <w:p>
                       <w:pPr>
-                        <w:pStyle w:val="FrameContentsuser"/>
+                        <w:pStyle w:val="FrameContents"/>
                         <w:spacing w:lineRule="auto" w:line="259" w:before="0" w:after="120"/>
                         <w:rPr>
                           <w:sz w:val="36"/>
@@ -3721,7 +3809,7 @@
                     </w:p>
                     <w:p>
                       <w:pPr>
-                        <w:pStyle w:val="FrameContentsuser"/>
+                        <w:pStyle w:val="FrameContents"/>
                         <w:spacing w:lineRule="auto" w:line="259" w:before="0" w:after="120"/>
                         <w:rPr>
                           <w:sz w:val="36"/>
@@ -3747,7 +3835,7 @@
                     </w:p>
                     <w:p>
                       <w:pPr>
-                        <w:pStyle w:val="FrameContentsuser"/>
+                        <w:pStyle w:val="FrameContents"/>
                         <w:spacing w:lineRule="auto" w:line="259" w:before="0" w:after="120"/>
                         <w:rPr>
                           <w:sz w:val="36"/>
@@ -3773,7 +3861,7 @@
                     </w:p>
                     <w:p>
                       <w:pPr>
-                        <w:pStyle w:val="FrameContentsuser"/>
+                        <w:pStyle w:val="FrameContents"/>
                         <w:spacing w:lineRule="auto" w:line="259" w:before="0" w:after="120"/>
                         <w:rPr>
                           <w:sz w:val="36"/>
@@ -3813,9 +3901,9 @@
                   <wp:posOffset>7174865</wp:posOffset>
                 </wp:positionH>
                 <wp:positionV relativeFrom="paragraph">
-                  <wp:posOffset>5757545</wp:posOffset>
+                  <wp:posOffset>5983605</wp:posOffset>
                 </wp:positionV>
-                <wp:extent cx="6120765" cy="2859405"/>
+                <wp:extent cx="6120765" cy="2633345"/>
                 <wp:effectExtent l="5715" t="5715" r="4445" b="4445"/>
                 <wp:wrapSquare wrapText="bothSides"/>
                 <wp:docPr id="40" name="Rectangle 236"/>
@@ -3826,7 +3914,7 @@
                       <wps:spPr>
                         <a:xfrm>
                           <a:off x="0" y="0"/>
-                          <a:ext cx="6120720" cy="2859480"/>
+                          <a:ext cx="6120720" cy="2633400"/>
                         </a:xfrm>
                         <a:prstGeom prst="rect">
                           <a:avLst/>
@@ -3851,7 +3939,7 @@
                         <w:txbxContent>
                           <w:p>
                             <w:pPr>
-                              <w:pStyle w:val="FrameContentsuser"/>
+                              <w:pStyle w:val="FrameContents"/>
                               <w:spacing w:lineRule="auto" w:line="259" w:before="0" w:after="120"/>
                               <w:rPr>
                                 <w:sz w:val="36"/>
@@ -3877,7 +3965,7 @@
                           </w:p>
                           <w:p>
                             <w:pPr>
-                              <w:pStyle w:val="FrameContentsuser"/>
+                              <w:pStyle w:val="FrameContents"/>
                               <w:spacing w:lineRule="auto" w:line="259" w:before="0" w:after="120"/>
                               <w:rPr>
                                 <w:sz w:val="36"/>
@@ -3903,7 +3991,7 @@
                           </w:p>
                           <w:p>
                             <w:pPr>
-                              <w:pStyle w:val="FrameContentsuser"/>
+                              <w:pStyle w:val="FrameContents"/>
                               <w:spacing w:lineRule="auto" w:line="259" w:before="0" w:after="120"/>
                               <w:rPr>
                                 <w:sz w:val="36"/>
@@ -3929,7 +4017,7 @@
                           </w:p>
                           <w:p>
                             <w:pPr>
-                              <w:pStyle w:val="FrameContentsuser"/>
+                              <w:pStyle w:val="FrameContents"/>
                               <w:spacing w:lineRule="auto" w:line="259" w:before="0" w:after="120"/>
                               <w:rPr>
                                 <w:sz w:val="36"/>
@@ -3966,14 +4054,14 @@
           </mc:Choice>
           <mc:Fallback>
             <w:pict>
-              <v:rect id="shape_0" fillcolor="white" stroked="t" o:allowincell="f" style="position:absolute;margin-left:564.95pt;margin-top:453.35pt;width:481.9pt;height:225.1pt;mso-wrap-style:square;v-text-anchor:top">
+              <v:rect id="shape_0" fillcolor="white" stroked="t" o:allowincell="f" style="position:absolute;margin-left:564.95pt;margin-top:471.15pt;width:481.9pt;height:207.3pt;mso-wrap-style:square;v-text-anchor:top">
                 <v:fill o:detectmouseclick="t" type="solid" color2="black"/>
                 <v:stroke color="black" weight="9360" joinstyle="miter" endcap="flat"/>
                 <v:textbox>
                   <w:txbxContent>
                     <w:p>
                       <w:pPr>
-                        <w:pStyle w:val="FrameContentsuser"/>
+                        <w:pStyle w:val="FrameContents"/>
                         <w:spacing w:lineRule="auto" w:line="259" w:before="0" w:after="120"/>
                         <w:rPr>
                           <w:sz w:val="36"/>
@@ -3999,7 +4087,7 @@
                     </w:p>
                     <w:p>
                       <w:pPr>
-                        <w:pStyle w:val="FrameContentsuser"/>
+                        <w:pStyle w:val="FrameContents"/>
                         <w:spacing w:lineRule="auto" w:line="259" w:before="0" w:after="120"/>
                         <w:rPr>
                           <w:sz w:val="36"/>
@@ -4025,7 +4113,7 @@
                     </w:p>
                     <w:p>
                       <w:pPr>
-                        <w:pStyle w:val="FrameContentsuser"/>
+                        <w:pStyle w:val="FrameContents"/>
                         <w:spacing w:lineRule="auto" w:line="259" w:before="0" w:after="120"/>
                         <w:rPr>
                           <w:sz w:val="36"/>
@@ -4051,7 +4139,7 @@
                     </w:p>
                     <w:p>
                       <w:pPr>
-                        <w:pStyle w:val="FrameContentsuser"/>
+                        <w:pStyle w:val="FrameContents"/>
                         <w:spacing w:lineRule="auto" w:line="259" w:before="0" w:after="120"/>
                         <w:rPr>
                           <w:sz w:val="36"/>
@@ -5198,15 +5286,15 @@
       <w:szCs w:val="48"/>
     </w:rPr>
   </w:style>
-  <w:style w:type="paragraph" w:styleId="FrameContentsuser">
-    <w:name w:val="Frame Contents (user)"/>
+  <w:style w:type="paragraph" w:styleId="FrameContents">
+    <w:name w:val="Frame Contents"/>
     <w:basedOn w:val="Normal"/>
     <w:qFormat/>
     <w:pPr/>
     <w:rPr/>
   </w:style>
-  <w:style w:type="paragraph" w:styleId="FrameContents">
-    <w:name w:val="Frame Contents"/>
+  <w:style w:type="paragraph" w:styleId="FrameContentsuser">
+    <w:name w:val="Frame Contents (user)"/>
     <w:basedOn w:val="Normal"/>
     <w:qFormat/>
     <w:pPr/>

</xml_diff>